<commit_message>
Ship LightGBM + TabPFN v2 blend predictions; document TabFM comparison
- validation_predictions.csv and december_chart_inputs.csv regenerated with
  the 50/50 log-space blend (temporal-holdout MAE $58.75 vs $63.23 for
  LightGBM alone on identical rows, -7.1%)
- report: new foundation-model section in the DOCX, tabfm_metrics.json,
  final_blend_summary.json, refreshed December chart, updated Loom outline
- README: results table, blend reproduction steps

Co-Authored-By: Claude Fable 5 <noreply@anthropic.com>
Claude-Session: https://claude.ai/code/session_018GQXbVPf375ojjP9EWCGxU
</commit_message>
<xml_diff>
--- a/report/Freight_Rate_Report.docx
+++ b/report/Freight_Rate_Report.docx
@@ -54,7 +54,7 @@
           <w:sz w:val="21"/>
           <w:szCs w:val="21"/>
         </w:rPr>
-        <w:t xml:space="preserve">Posted rates are modeled with a gradient-boosted tree model (LightGBM) on </w:t>
+        <w:t xml:space="preserve">Posted rates are modeled on </w:t>
       </w:r>
       <w:r>
         <w:rPr>
@@ -70,7 +70,7 @@
           <w:sz w:val="21"/>
           <w:szCs w:val="21"/>
         </w:rPr>
-        <w:t xml:space="preserve">. On a strictly forward-in-time holdout (train Jan–Aug, predict Sep–Oct) the model reaches </w:t>
+        <w:t xml:space="preserve"> with a LightGBM gradient-boosted tree model, which on a strictly forward-in-time holdout (train Jan–Aug, predict Sep–Oct) reaches </w:t>
       </w:r>
       <w:r>
         <w:rPr>
@@ -86,7 +86,23 @@
           <w:sz w:val="21"/>
           <w:szCs w:val="21"/>
         </w:rPr>
-        <w:t xml:space="preserve"> on clean rows — less than half the error of a rate-per-mile lookup baseline ($135 MAE). The final model is retrained on all ten labeled months and scores every load in validation.csv plus the fixed Lexington → Fort Wayne December lane.</w:t>
+        <w:t xml:space="preserve"> on clean rows — less than half the error of a rate-per-mile lookup baseline ($135 MAE). A tabular-foundation-model comparison on the same holdout showed a </w:t>
+      </w:r>
+      <w:r>
+        <w:rPr>
+          <w:b/>
+          <w:bCs/>
+          <w:sz w:val="21"/>
+          <w:szCs w:val="21"/>
+        </w:rPr>
+        <w:t xml:space="preserve">50/50 log-space blend of LightGBM and a bagged TabPFN v2 ensemble cuts MAE a further 7%</w:t>
+      </w:r>
+      <w:r>
+        <w:rPr>
+          <w:sz w:val="21"/>
+          <w:szCs w:val="21"/>
+        </w:rPr>
+        <w:t xml:space="preserve">, so the shipped predictions use that blend, retrained/re-contexted on all ten labeled months, for every load in validation.csv plus the fixed Lexington → Fort Wayne December lane.</w:t>
       </w:r>
     </w:p>
     <w:p>
@@ -1104,7 +1120,689 @@
           <w:sz w:val="21"/>
           <w:szCs w:val="21"/>
         </w:rPr>
-        <w:t xml:space="preserve">Feature importance confirms the EDA story: distance features carry most of the gain, followed by equipment, quote_signal, weight, and the market/seasonality block. A linear model was rejected because the distance taper, equipment × distance interactions, and market nonlinearities are exactly what trees capture cheaply; a neural model adds risk without more data.</w:t>
+        <w:t xml:space="preserve">Feature importance confirms the EDA story: distance features carry most of the gain, followed by equipment, quote_signal, weight, and the market/seasonality block. A linear model was rejected because the distance taper, equipment × distance interactions, and market nonlinearities are exactly what trees capture cheaply.</w:t>
+      </w:r>
+    </w:p>
+    <w:p>
+      <w:pPr>
+        <w:pStyle w:val="Heading2"/>
+        <w:spacing w:after="100" w:before="240"/>
+      </w:pPr>
+      <w:r>
+        <w:rPr>
+          <w:color w:val="064A56"/>
+        </w:rPr>
+        <w:t xml:space="preserve">5.1 Tabular foundation models (TabPFN v2, TabICL v2)</w:t>
+      </w:r>
+    </w:p>
+    <w:p>
+      <w:pPr>
+        <w:spacing w:after="120" w:line="276"/>
+      </w:pPr>
+      <w:r>
+        <w:rPr>
+          <w:sz w:val="21"/>
+          <w:szCs w:val="21"/>
+        </w:rPr>
+        <w:t xml:space="preserve">Two recent tabular foundation models were benchmarked against LightGBM on a fixed 3,000-row subsample of the same temporal holdout (identical rows for every model; clean-row metrics). TabPFN v2 is an in-context learner capped at ~10k training rows per fit, so it was applied as a bagged ensemble of four disjoint 8,000-row contexts whose log-predictions are averaged. TabICL v2 could not be evaluated in the build environment (its checkpoints are served from gated hosting the environment cannot reach); the experiment script runs it automatically wherever the weights are reachable.</w:t>
+      </w:r>
+    </w:p>
+    <w:tbl>
+      <w:tblPr>
+        <w:tblW w:type="dxa" w:w="9360"/>
+        <w:tblBorders>
+          <w:top w:val="single" w:color="auto" w:sz="4"/>
+          <w:left w:val="single" w:color="auto" w:sz="4"/>
+          <w:bottom w:val="single" w:color="auto" w:sz="4"/>
+          <w:right w:val="single" w:color="auto" w:sz="4"/>
+          <w:insideH w:val="single" w:color="auto" w:sz="4"/>
+          <w:insideV w:val="single" w:color="auto" w:sz="4"/>
+        </w:tblBorders>
+      </w:tblPr>
+      <w:tblGrid>
+        <w:gridCol w:w="3760"/>
+        <w:gridCol w:w="1500"/>
+        <w:gridCol w:w="1500"/>
+        <w:gridCol w:w="2600"/>
+      </w:tblGrid>
+      <w:tr>
+        <w:tc>
+          <w:tcPr>
+            <w:tcW w:type="dxa" w:w="3760"/>
+            <w:shd w:fill="E3EDEF" w:val="clear"/>
+            <w:tcMar>
+              <w:top w:type="dxa" w:w="60"/>
+              <w:left w:type="dxa" w:w="110"/>
+              <w:bottom w:type="dxa" w:w="60"/>
+              <w:right w:type="dxa" w:w="110"/>
+            </w:tcMar>
+          </w:tcPr>
+          <w:p>
+            <w:pPr>
+              <w:jc w:val="left"/>
+            </w:pPr>
+            <w:r>
+              <w:rPr>
+                <w:b/>
+                <w:bCs/>
+                <w:sz w:val="20"/>
+                <w:szCs w:val="20"/>
+              </w:rPr>
+              <w:t xml:space="preserve">Model (identical 3,000 holdout rows)</w:t>
+            </w:r>
+          </w:p>
+        </w:tc>
+        <w:tc>
+          <w:tcPr>
+            <w:tcW w:type="dxa" w:w="1500"/>
+            <w:shd w:fill="E3EDEF" w:val="clear"/>
+            <w:tcMar>
+              <w:top w:type="dxa" w:w="60"/>
+              <w:left w:type="dxa" w:w="110"/>
+              <w:bottom w:type="dxa" w:w="60"/>
+              <w:right w:type="dxa" w:w="110"/>
+            </w:tcMar>
+          </w:tcPr>
+          <w:p>
+            <w:pPr>
+              <w:jc w:val="right"/>
+            </w:pPr>
+            <w:r>
+              <w:rPr>
+                <w:b/>
+                <w:bCs/>
+                <w:sz w:val="20"/>
+                <w:szCs w:val="20"/>
+              </w:rPr>
+              <w:t xml:space="preserve">MAE ($)</w:t>
+            </w:r>
+          </w:p>
+        </w:tc>
+        <w:tc>
+          <w:tcPr>
+            <w:tcW w:type="dxa" w:w="1500"/>
+            <w:shd w:fill="E3EDEF" w:val="clear"/>
+            <w:tcMar>
+              <w:top w:type="dxa" w:w="60"/>
+              <w:left w:type="dxa" w:w="110"/>
+              <w:bottom w:type="dxa" w:w="60"/>
+              <w:right w:type="dxa" w:w="110"/>
+            </w:tcMar>
+          </w:tcPr>
+          <w:p>
+            <w:pPr>
+              <w:jc w:val="right"/>
+            </w:pPr>
+            <w:r>
+              <w:rPr>
+                <w:b/>
+                <w:bCs/>
+                <w:sz w:val="20"/>
+                <w:szCs w:val="20"/>
+              </w:rPr>
+              <w:t xml:space="preserve">MAPE (%)</w:t>
+            </w:r>
+          </w:p>
+        </w:tc>
+        <w:tc>
+          <w:tcPr>
+            <w:tcW w:type="dxa" w:w="2600"/>
+            <w:shd w:fill="E3EDEF" w:val="clear"/>
+            <w:tcMar>
+              <w:top w:type="dxa" w:w="60"/>
+              <w:left w:type="dxa" w:w="110"/>
+              <w:bottom w:type="dxa" w:w="60"/>
+              <w:right w:type="dxa" w:w="110"/>
+            </w:tcMar>
+          </w:tcPr>
+          <w:p>
+            <w:pPr>
+              <w:jc w:val="left"/>
+            </w:pPr>
+            <w:r>
+              <w:rPr>
+                <w:b/>
+                <w:bCs/>
+                <w:sz w:val="20"/>
+                <w:szCs w:val="20"/>
+              </w:rPr>
+              <w:t xml:space="preserve">Notes</w:t>
+            </w:r>
+          </w:p>
+        </w:tc>
+      </w:tr>
+      <w:tr>
+        <w:tc>
+          <w:tcPr>
+            <w:tcW w:type="dxa" w:w="3760"/>
+            <w:tcMar>
+              <w:top w:type="dxa" w:w="60"/>
+              <w:left w:type="dxa" w:w="110"/>
+              <w:bottom w:type="dxa" w:w="60"/>
+              <w:right w:type="dxa" w:w="110"/>
+            </w:tcMar>
+          </w:tcPr>
+          <w:p>
+            <w:pPr>
+              <w:jc w:val="left"/>
+            </w:pPr>
+            <w:r>
+              <w:rPr>
+                <w:b w:val="false"/>
+                <w:bCs w:val="false"/>
+                <w:sz w:val="20"/>
+                <w:szCs w:val="20"/>
+              </w:rPr>
+              <w:t xml:space="preserve">LightGBM</w:t>
+            </w:r>
+          </w:p>
+        </w:tc>
+        <w:tc>
+          <w:tcPr>
+            <w:tcW w:type="dxa" w:w="1500"/>
+            <w:tcMar>
+              <w:top w:type="dxa" w:w="60"/>
+              <w:left w:type="dxa" w:w="110"/>
+              <w:bottom w:type="dxa" w:w="60"/>
+              <w:right w:type="dxa" w:w="110"/>
+            </w:tcMar>
+          </w:tcPr>
+          <w:p>
+            <w:pPr>
+              <w:jc w:val="right"/>
+            </w:pPr>
+            <w:r>
+              <w:rPr>
+                <w:b w:val="false"/>
+                <w:bCs w:val="false"/>
+                <w:sz w:val="20"/>
+                <w:szCs w:val="20"/>
+              </w:rPr>
+              <w:t xml:space="preserve">63.23</w:t>
+            </w:r>
+          </w:p>
+        </w:tc>
+        <w:tc>
+          <w:tcPr>
+            <w:tcW w:type="dxa" w:w="1500"/>
+            <w:tcMar>
+              <w:top w:type="dxa" w:w="60"/>
+              <w:left w:type="dxa" w:w="110"/>
+              <w:bottom w:type="dxa" w:w="60"/>
+              <w:right w:type="dxa" w:w="110"/>
+            </w:tcMar>
+          </w:tcPr>
+          <w:p>
+            <w:pPr>
+              <w:jc w:val="right"/>
+            </w:pPr>
+            <w:r>
+              <w:rPr>
+                <w:b w:val="false"/>
+                <w:bCs w:val="false"/>
+                <w:sz w:val="20"/>
+                <w:szCs w:val="20"/>
+              </w:rPr>
+              <w:t xml:space="preserve">2.50</w:t>
+            </w:r>
+          </w:p>
+        </w:tc>
+        <w:tc>
+          <w:tcPr>
+            <w:tcW w:type="dxa" w:w="2600"/>
+            <w:tcMar>
+              <w:top w:type="dxa" w:w="60"/>
+              <w:left w:type="dxa" w:w="110"/>
+              <w:bottom w:type="dxa" w:w="60"/>
+              <w:right w:type="dxa" w:w="110"/>
+            </w:tcMar>
+          </w:tcPr>
+          <w:p>
+            <w:pPr>
+              <w:jc w:val="left"/>
+            </w:pPr>
+            <w:r>
+              <w:rPr>
+                <w:b w:val="false"/>
+                <w:bCs w:val="false"/>
+                <w:sz w:val="20"/>
+                <w:szCs w:val="20"/>
+              </w:rPr>
+              <w:t xml:space="preserve">reference</w:t>
+            </w:r>
+          </w:p>
+        </w:tc>
+      </w:tr>
+      <w:tr>
+        <w:tc>
+          <w:tcPr>
+            <w:tcW w:type="dxa" w:w="3760"/>
+            <w:shd w:fill="F2F7F8" w:val="clear"/>
+            <w:tcMar>
+              <w:top w:type="dxa" w:w="60"/>
+              <w:left w:type="dxa" w:w="110"/>
+              <w:bottom w:type="dxa" w:w="60"/>
+              <w:right w:type="dxa" w:w="110"/>
+            </w:tcMar>
+          </w:tcPr>
+          <w:p>
+            <w:pPr>
+              <w:jc w:val="left"/>
+            </w:pPr>
+            <w:r>
+              <w:rPr>
+                <w:b w:val="false"/>
+                <w:bCs w:val="false"/>
+                <w:sz w:val="20"/>
+                <w:szCs w:val="20"/>
+              </w:rPr>
+              <w:t xml:space="preserve">TabPFN v2 — single 8k context</w:t>
+            </w:r>
+          </w:p>
+        </w:tc>
+        <w:tc>
+          <w:tcPr>
+            <w:tcW w:type="dxa" w:w="1500"/>
+            <w:shd w:fill="F2F7F8" w:val="clear"/>
+            <w:tcMar>
+              <w:top w:type="dxa" w:w="60"/>
+              <w:left w:type="dxa" w:w="110"/>
+              <w:bottom w:type="dxa" w:w="60"/>
+              <w:right w:type="dxa" w:w="110"/>
+            </w:tcMar>
+          </w:tcPr>
+          <w:p>
+            <w:pPr>
+              <w:jc w:val="right"/>
+            </w:pPr>
+            <w:r>
+              <w:rPr>
+                <w:b w:val="false"/>
+                <w:bCs w:val="false"/>
+                <w:sz w:val="20"/>
+                <w:szCs w:val="20"/>
+              </w:rPr>
+              <w:t xml:space="preserve">78.53</w:t>
+            </w:r>
+          </w:p>
+        </w:tc>
+        <w:tc>
+          <w:tcPr>
+            <w:tcW w:type="dxa" w:w="1500"/>
+            <w:shd w:fill="F2F7F8" w:val="clear"/>
+            <w:tcMar>
+              <w:top w:type="dxa" w:w="60"/>
+              <w:left w:type="dxa" w:w="110"/>
+              <w:bottom w:type="dxa" w:w="60"/>
+              <w:right w:type="dxa" w:w="110"/>
+            </w:tcMar>
+          </w:tcPr>
+          <w:p>
+            <w:pPr>
+              <w:jc w:val="right"/>
+            </w:pPr>
+            <w:r>
+              <w:rPr>
+                <w:b w:val="false"/>
+                <w:bCs w:val="false"/>
+                <w:sz w:val="20"/>
+                <w:szCs w:val="20"/>
+              </w:rPr>
+              <w:t xml:space="preserve">3.22</w:t>
+            </w:r>
+          </w:p>
+        </w:tc>
+        <w:tc>
+          <w:tcPr>
+            <w:tcW w:type="dxa" w:w="2600"/>
+            <w:shd w:fill="F2F7F8" w:val="clear"/>
+            <w:tcMar>
+              <w:top w:type="dxa" w:w="60"/>
+              <w:left w:type="dxa" w:w="110"/>
+              <w:bottom w:type="dxa" w:w="60"/>
+              <w:right w:type="dxa" w:w="110"/>
+            </w:tcMar>
+          </w:tcPr>
+          <w:p>
+            <w:pPr>
+              <w:jc w:val="left"/>
+            </w:pPr>
+            <w:r>
+              <w:rPr>
+                <w:b w:val="false"/>
+                <w:bCs w:val="false"/>
+                <w:sz w:val="20"/>
+                <w:szCs w:val="20"/>
+              </w:rPr>
+              <w:t xml:space="preserve">in-context, no training</w:t>
+            </w:r>
+          </w:p>
+        </w:tc>
+      </w:tr>
+      <w:tr>
+        <w:tc>
+          <w:tcPr>
+            <w:tcW w:type="dxa" w:w="3760"/>
+            <w:tcMar>
+              <w:top w:type="dxa" w:w="60"/>
+              <w:left w:type="dxa" w:w="110"/>
+              <w:bottom w:type="dxa" w:w="60"/>
+              <w:right w:type="dxa" w:w="110"/>
+            </w:tcMar>
+          </w:tcPr>
+          <w:p>
+            <w:pPr>
+              <w:jc w:val="left"/>
+            </w:pPr>
+            <w:r>
+              <w:rPr>
+                <w:b w:val="false"/>
+                <w:bCs w:val="false"/>
+                <w:sz w:val="20"/>
+                <w:szCs w:val="20"/>
+              </w:rPr>
+              <w:t xml:space="preserve">TabPFN v2 — bagged 4 × 8k contexts</w:t>
+            </w:r>
+          </w:p>
+        </w:tc>
+        <w:tc>
+          <w:tcPr>
+            <w:tcW w:type="dxa" w:w="1500"/>
+            <w:tcMar>
+              <w:top w:type="dxa" w:w="60"/>
+              <w:left w:type="dxa" w:w="110"/>
+              <w:bottom w:type="dxa" w:w="60"/>
+              <w:right w:type="dxa" w:w="110"/>
+            </w:tcMar>
+          </w:tcPr>
+          <w:p>
+            <w:pPr>
+              <w:jc w:val="right"/>
+            </w:pPr>
+            <w:r>
+              <w:rPr>
+                <w:b w:val="false"/>
+                <w:bCs w:val="false"/>
+                <w:sz w:val="20"/>
+                <w:szCs w:val="20"/>
+              </w:rPr>
+              <w:t xml:space="preserve">65.27</w:t>
+            </w:r>
+          </w:p>
+        </w:tc>
+        <w:tc>
+          <w:tcPr>
+            <w:tcW w:type="dxa" w:w="1500"/>
+            <w:tcMar>
+              <w:top w:type="dxa" w:w="60"/>
+              <w:left w:type="dxa" w:w="110"/>
+              <w:bottom w:type="dxa" w:w="60"/>
+              <w:right w:type="dxa" w:w="110"/>
+            </w:tcMar>
+          </w:tcPr>
+          <w:p>
+            <w:pPr>
+              <w:jc w:val="right"/>
+            </w:pPr>
+            <w:r>
+              <w:rPr>
+                <w:b w:val="false"/>
+                <w:bCs w:val="false"/>
+                <w:sz w:val="20"/>
+                <w:szCs w:val="20"/>
+              </w:rPr>
+              <w:t xml:space="preserve">2.58</w:t>
+            </w:r>
+          </w:p>
+        </w:tc>
+        <w:tc>
+          <w:tcPr>
+            <w:tcW w:type="dxa" w:w="2600"/>
+            <w:tcMar>
+              <w:top w:type="dxa" w:w="60"/>
+              <w:left w:type="dxa" w:w="110"/>
+              <w:bottom w:type="dxa" w:w="60"/>
+              <w:right w:type="dxa" w:w="110"/>
+            </w:tcMar>
+          </w:tcPr>
+          <w:p>
+            <w:pPr>
+              <w:jc w:val="left"/>
+            </w:pPr>
+            <w:r>
+              <w:rPr>
+                <w:b w:val="false"/>
+                <w:bCs w:val="false"/>
+                <w:sz w:val="20"/>
+                <w:szCs w:val="20"/>
+              </w:rPr>
+              <w:t xml:space="preserve">bagging closes most of the gap</w:t>
+            </w:r>
+          </w:p>
+        </w:tc>
+      </w:tr>
+      <w:tr>
+        <w:tc>
+          <w:tcPr>
+            <w:tcW w:type="dxa" w:w="3760"/>
+            <w:shd w:fill="F2F7F8" w:val="clear"/>
+            <w:tcMar>
+              <w:top w:type="dxa" w:w="60"/>
+              <w:left w:type="dxa" w:w="110"/>
+              <w:bottom w:type="dxa" w:w="60"/>
+              <w:right w:type="dxa" w:w="110"/>
+            </w:tcMar>
+          </w:tcPr>
+          <w:p>
+            <w:pPr>
+              <w:jc w:val="left"/>
+            </w:pPr>
+            <w:r>
+              <w:rPr>
+                <w:b/>
+                <w:bCs/>
+                <w:sz w:val="20"/>
+                <w:szCs w:val="20"/>
+              </w:rPr>
+              <w:t xml:space="preserve">Blend: 0.5·LGB + 0.5·TabPFN (log)</w:t>
+            </w:r>
+          </w:p>
+        </w:tc>
+        <w:tc>
+          <w:tcPr>
+            <w:tcW w:type="dxa" w:w="1500"/>
+            <w:shd w:fill="F2F7F8" w:val="clear"/>
+            <w:tcMar>
+              <w:top w:type="dxa" w:w="60"/>
+              <w:left w:type="dxa" w:w="110"/>
+              <w:bottom w:type="dxa" w:w="60"/>
+              <w:right w:type="dxa" w:w="110"/>
+            </w:tcMar>
+          </w:tcPr>
+          <w:p>
+            <w:pPr>
+              <w:jc w:val="right"/>
+            </w:pPr>
+            <w:r>
+              <w:rPr>
+                <w:b/>
+                <w:bCs/>
+                <w:sz w:val="20"/>
+                <w:szCs w:val="20"/>
+              </w:rPr>
+              <w:t xml:space="preserve">58.75</w:t>
+            </w:r>
+          </w:p>
+        </w:tc>
+        <w:tc>
+          <w:tcPr>
+            <w:tcW w:type="dxa" w:w="1500"/>
+            <w:shd w:fill="F2F7F8" w:val="clear"/>
+            <w:tcMar>
+              <w:top w:type="dxa" w:w="60"/>
+              <w:left w:type="dxa" w:w="110"/>
+              <w:bottom w:type="dxa" w:w="60"/>
+              <w:right w:type="dxa" w:w="110"/>
+            </w:tcMar>
+          </w:tcPr>
+          <w:p>
+            <w:pPr>
+              <w:jc w:val="right"/>
+            </w:pPr>
+            <w:r>
+              <w:rPr>
+                <w:b/>
+                <w:bCs/>
+                <w:sz w:val="20"/>
+                <w:szCs w:val="20"/>
+              </w:rPr>
+              <w:t xml:space="preserve">—</w:t>
+            </w:r>
+          </w:p>
+        </w:tc>
+        <w:tc>
+          <w:tcPr>
+            <w:tcW w:type="dxa" w:w="2600"/>
+            <w:shd w:fill="F2F7F8" w:val="clear"/>
+            <w:tcMar>
+              <w:top w:type="dxa" w:w="60"/>
+              <w:left w:type="dxa" w:w="110"/>
+              <w:bottom w:type="dxa" w:w="60"/>
+              <w:right w:type="dxa" w:w="110"/>
+            </w:tcMar>
+          </w:tcPr>
+          <w:p>
+            <w:pPr>
+              <w:jc w:val="left"/>
+            </w:pPr>
+            <w:r>
+              <w:rPr>
+                <w:b/>
+                <w:bCs/>
+                <w:sz w:val="20"/>
+                <w:szCs w:val="20"/>
+              </w:rPr>
+              <w:t xml:space="preserve">−7.1% MAE vs LightGBM</w:t>
+            </w:r>
+          </w:p>
+        </w:tc>
+      </w:tr>
+      <w:tr>
+        <w:tc>
+          <w:tcPr>
+            <w:tcW w:type="dxa" w:w="3760"/>
+            <w:tcMar>
+              <w:top w:type="dxa" w:w="60"/>
+              <w:left w:type="dxa" w:w="110"/>
+              <w:bottom w:type="dxa" w:w="60"/>
+              <w:right w:type="dxa" w:w="110"/>
+            </w:tcMar>
+          </w:tcPr>
+          <w:p>
+            <w:pPr>
+              <w:jc w:val="left"/>
+            </w:pPr>
+            <w:r>
+              <w:rPr>
+                <w:b w:val="false"/>
+                <w:bCs w:val="false"/>
+                <w:sz w:val="20"/>
+                <w:szCs w:val="20"/>
+              </w:rPr>
+              <w:t xml:space="preserve">TabICL v2</w:t>
+            </w:r>
+          </w:p>
+        </w:tc>
+        <w:tc>
+          <w:tcPr>
+            <w:tcW w:type="dxa" w:w="1500"/>
+            <w:tcMar>
+              <w:top w:type="dxa" w:w="60"/>
+              <w:left w:type="dxa" w:w="110"/>
+              <w:bottom w:type="dxa" w:w="60"/>
+              <w:right w:type="dxa" w:w="110"/>
+            </w:tcMar>
+          </w:tcPr>
+          <w:p>
+            <w:pPr>
+              <w:jc w:val="right"/>
+            </w:pPr>
+            <w:r>
+              <w:rPr>
+                <w:b w:val="false"/>
+                <w:bCs w:val="false"/>
+                <w:sz w:val="20"/>
+                <w:szCs w:val="20"/>
+              </w:rPr>
+              <w:t xml:space="preserve">n/a</w:t>
+            </w:r>
+          </w:p>
+        </w:tc>
+        <w:tc>
+          <w:tcPr>
+            <w:tcW w:type="dxa" w:w="1500"/>
+            <w:tcMar>
+              <w:top w:type="dxa" w:w="60"/>
+              <w:left w:type="dxa" w:w="110"/>
+              <w:bottom w:type="dxa" w:w="60"/>
+              <w:right w:type="dxa" w:w="110"/>
+            </w:tcMar>
+          </w:tcPr>
+          <w:p>
+            <w:pPr>
+              <w:jc w:val="right"/>
+            </w:pPr>
+            <w:r>
+              <w:rPr>
+                <w:b w:val="false"/>
+                <w:bCs w:val="false"/>
+                <w:sz w:val="20"/>
+                <w:szCs w:val="20"/>
+              </w:rPr>
+              <w:t xml:space="preserve">n/a</w:t>
+            </w:r>
+          </w:p>
+        </w:tc>
+        <w:tc>
+          <w:tcPr>
+            <w:tcW w:type="dxa" w:w="2600"/>
+            <w:tcMar>
+              <w:top w:type="dxa" w:w="60"/>
+              <w:left w:type="dxa" w:w="110"/>
+              <w:bottom w:type="dxa" w:w="60"/>
+              <w:right w:type="dxa" w:w="110"/>
+            </w:tcMar>
+          </w:tcPr>
+          <w:p>
+            <w:pPr>
+              <w:jc w:val="left"/>
+            </w:pPr>
+            <w:r>
+              <w:rPr>
+                <w:b w:val="false"/>
+                <w:bCs w:val="false"/>
+                <w:sz w:val="20"/>
+                <w:szCs w:val="20"/>
+              </w:rPr>
+              <w:t xml:space="preserve">weights unreachable in build env</w:t>
+            </w:r>
+          </w:p>
+        </w:tc>
+      </w:tr>
+    </w:tbl>
+    <w:p>
+      <w:pPr>
+        <w:spacing w:after="160" w:before="100"/>
+      </w:pPr>
+      <w:r>
+        <w:rPr>
+          <w:i/>
+          <w:iCs/>
+          <w:color w:val="455A60"/>
+          <w:sz w:val="19"/>
+          <w:szCs w:val="19"/>
+        </w:rPr>
+        <w:t xml:space="preserve">TabPFN alone does not beat a tuned LightGBM here, but its errors are decorrelated enough that the simple 50/50 log-space blend wins by ~7% MAE, with a flat optimum across blend weights 0.4–0.6 (robust, not tuned to the grid). The shipped validation_predictions.csv and December chart use this blend; src/train_predict.py reproduces the LightGBM-only outputs.</w:t>
       </w:r>
     </w:p>
     <w:p>
@@ -1160,7 +1858,7 @@
           <w:sz w:val="21"/>
           <w:szCs w:val="21"/>
         </w:rPr>
-        <w:t xml:space="preserve"> from 21 historical Lexington → Fort Wayne loads, with day-to-day quote variation entering through the pooled daily aggregate. Predictions land at $820–$843 — inside the lane’s historical $758–$973 range — and reproduce the weekly market cycle (midweek peaks, weekend troughs).</w:t>
+        <w:t xml:space="preserve"> from 21 historical Lexington → Fort Wayne loads, with day-to-day quote variation entering through the pooled daily aggregate. The blended predictions land at $821–$840 — inside the lane’s historical $758–$973 range — and reproduce the weekly market cycle (midweek peaks, weekend troughs).</w:t>
       </w:r>
     </w:p>
     <w:p>
@@ -1269,7 +1967,7 @@
           <w:sz w:val="21"/>
           <w:szCs w:val="21"/>
         </w:rPr>
-        <w:t xml:space="preserve">python -m pip install -r requirements.txt, then python src/validate.py (validation experiments), python src/train_predict.py (final model + both prediction files), python score.py --predictions validation_predictions.csv --december-predictions data/december_chart_inputs.csv. All randomness is seeded; reruns reproduce the committed outputs exactly.</w:t>
+        <w:t xml:space="preserve">python -m pip install -r requirements.txt (plus requirements-tabfm.txt for the foundation models), then: python src/validate.py (validation experiments), python src/tabfm_experiment.py (foundation-model comparison), python src/final_blend_predict.py (shipped blend predictions; src/train_predict.py for the LightGBM-only variant), and python score.py --predictions validation_predictions.csv --december-predictions data/december_chart_inputs.csv. All randomness is seeded, and the slow TabPFN steps checkpoint their progress and resume if interrupted.</w:t>
       </w:r>
     </w:p>
     <w:sectPr>

</xml_diff>

<commit_message>
Evaluate TabICL v2 with HF access: not competitive, shipped blend unchanged
With huggingface.co reachable, the TabICL v2 regressor checkpoint
(jingang/TabICL, tabicl-regressor-v2-20260212.ckpt) downloads and runs:
single 20k-row context, clean-row MAE $86.85 / MAPE 3.36% on the same
3,000 temporal-holdout rows as the other models (LightGBM $63.23,
bagged TabPFN v2 $65.27). The exhaustive 3-way log-space blend grid
puts TabICL's optimal weight at exactly zero -- the best 3-way blend is
the existing 0.5/0.5 LightGBM+TabPFN blend at $58.75 -- so the shipped
predictions are unchanged (scorer re-validated).

Recorded in report/tabfm_metrics.json, the README results table,
report section 5.1 (DOCX rebuilt), and the Loom outline. TabICL eval
predictions cached under .tabfm_cache/ like the other model outputs.

Co-Authored-By: Claude Fable 5 <noreply@anthropic.com>
Claude-Session: https://claude.ai/code/session_011oXwpE6kM7keds5V5KzsFp
</commit_message>
<xml_diff>
--- a/report/Freight_Rate_Report.docx
+++ b/report/Freight_Rate_Report.docx
@@ -1144,7 +1144,7 @@
           <w:sz w:val="21"/>
           <w:szCs w:val="21"/>
         </w:rPr>
-        <w:t xml:space="preserve">Two recent tabular foundation models were benchmarked against LightGBM on a fixed 3,000-row subsample of the same temporal holdout (identical rows for every model; clean-row metrics). TabPFN v2 is an in-context learner capped at ~10k training rows per fit, so it was applied as a bagged ensemble of four disjoint 8,000-row contexts whose log-predictions are averaged. TabICL v2 could not be evaluated in the build environment (its checkpoints are served from gated hosting the environment cannot reach); the experiment script runs it automatically wherever the weights are reachable.</w:t>
+        <w:t xml:space="preserve">Two recent tabular foundation models were benchmarked against LightGBM on a fixed 3,000-row subsample of the same temporal holdout (identical rows for every model; clean-row metrics). TabPFN v2 is an in-context learner capped at ~10k training rows per fit, so it was applied as a bagged ensemble of four disjoint 8,000-row contexts whose log-predictions are averaged. TabICL v2 targets large in-context training sets and was given a single 20,000-row context (CPU cap); despite the larger context it trails both LightGBM and bagged TabPFN at $86.85 MAE, and an exhaustive 3-way log-space blend-weight grid over all three models puts its optimal weight at exactly zero — the best 3-way blend is the existing 0.5/0.5 LightGBM + TabPFN blend, so TabICL was not added to the shipped predictions.</w:t>
       </w:r>
     </w:p>
     <w:tbl>
@@ -1709,7 +1709,7 @@
                 <w:sz w:val="20"/>
                 <w:szCs w:val="20"/>
               </w:rPr>
-              <w:t xml:space="preserve">TabICL v2</w:t>
+              <w:t xml:space="preserve">TabICL v2 — single 20k context</w:t>
             </w:r>
           </w:p>
         </w:tc>
@@ -1734,7 +1734,7 @@
                 <w:sz w:val="20"/>
                 <w:szCs w:val="20"/>
               </w:rPr>
-              <w:t xml:space="preserve">n/a</w:t>
+              <w:t xml:space="preserve">86.85</w:t>
             </w:r>
           </w:p>
         </w:tc>
@@ -1759,7 +1759,7 @@
                 <w:sz w:val="20"/>
                 <w:szCs w:val="20"/>
               </w:rPr>
-              <w:t xml:space="preserve">n/a</w:t>
+              <w:t xml:space="preserve">3.36</w:t>
             </w:r>
           </w:p>
         </w:tc>
@@ -1784,7 +1784,7 @@
                 <w:sz w:val="20"/>
                 <w:szCs w:val="20"/>
               </w:rPr>
-              <w:t xml:space="preserve">weights unreachable in build env</w:t>
+              <w:t xml:space="preserve">zero weight in 3-way blend grid</w:t>
             </w:r>
           </w:p>
         </w:tc>

</xml_diff>